<commit_message>
Writing Articles and Daily Cartoon update
</commit_message>
<xml_diff>
--- a/Articles/2026/4_Blender_Tips_and_Tricks/15_Checking_for_Loose_Geometry/Write Up.docx
+++ b/Articles/2026/4_Blender_Tips_and_Tricks/15_Checking_for_Loose_Geometry/Write Up.docx
@@ -10,7 +10,24 @@
         <w:t>Write Up</w:t>
       </w:r>
     </w:p>
-    <w:p/>
+    <w:p>
+      <w:r>
+        <w:t>This week, we will be taking a look at how we can clean up loose geometry. Extra edges and vertices floating around your model are never a good thing. They take up memory and can cause strange-looking crinkles in your mesh. But Blender has some handy tools for finding them. And after reading this article, you will know how to use them.</w:t>
+      </w:r>
+    </w:p>
+    <w:p>
+      <w:r>
+        <w:t>So, to learn a bit more about how you can do some beneficial housecleaning on your mesh, why don’t you join us for our brand-new article this week entitled:</w:t>
+      </w:r>
+    </w:p>
+    <w:p>
+      <w:pPr>
+        <w:pStyle w:val="Heading1"/>
+      </w:pPr>
+      <w:r>
+        <w:t>Checking for Loose Geometry</w:t>
+      </w:r>
+    </w:p>
     <w:p>
       <w:pPr>
         <w:pStyle w:val="Heading1"/>
@@ -1905,6 +1922,35 @@
       <w:spacing w:line="240" w:lineRule="auto"/>
     </w:pPr>
   </w:style>
+  <w:style w:type="paragraph" w:customStyle="1" w:styleId="pdq2pgselectionanchorcontainer">
+    <w:name w:val="pdq2pg_selectionanchorcontainer"/>
+    <w:basedOn w:val="Normal"/>
+    <w:rsid w:val="00971145"/>
+    <w:pPr>
+      <w:spacing w:before="100" w:beforeAutospacing="1" w:after="100" w:afterAutospacing="1" w:line="240" w:lineRule="auto"/>
+    </w:pPr>
+    <w:rPr>
+      <w:rFonts w:ascii="Times New Roman" w:eastAsia="Times New Roman" w:hAnsi="Times New Roman" w:cs="Times New Roman"/>
+      <w:sz w:val="24"/>
+      <w:szCs w:val="24"/>
+    </w:rPr>
+  </w:style>
+  <w:style w:type="paragraph" w:styleId="NormalWeb">
+    <w:name w:val="Normal (Web)"/>
+    <w:basedOn w:val="Normal"/>
+    <w:uiPriority w:val="99"/>
+    <w:semiHidden/>
+    <w:unhideWhenUsed/>
+    <w:rsid w:val="00971145"/>
+    <w:pPr>
+      <w:spacing w:before="100" w:beforeAutospacing="1" w:after="100" w:afterAutospacing="1" w:line="240" w:lineRule="auto"/>
+    </w:pPr>
+    <w:rPr>
+      <w:rFonts w:ascii="Times New Roman" w:eastAsia="Times New Roman" w:hAnsi="Times New Roman" w:cs="Times New Roman"/>
+      <w:sz w:val="24"/>
+      <w:szCs w:val="24"/>
+    </w:rPr>
+  </w:style>
 </w:styles>
 </file>
 

</xml_diff>